<commit_message>
Ajusta item 1.2 do contrato da Jessica para atividades operacionais de analista
Co-Authored-By: Claude Opus 5.5 <noreply@anthropic.com>
Claude-Session: https://claude.ai/code/session_01TBxs8gCeiWwRwhSGiAgvU7
</commit_message>
<xml_diff>
--- a/contratos/contrato-jessica-analista-administrativo-financeiro.docx
+++ b/contratos/contrato-jessica-analista-administrativo-financeiro.docx
@@ -456,7 +456,7 @@
         </w:numPr>
       </w:pPr>
       <w:r>
-        <w:t xml:space="preserve">Estruturar, organizar e acompanhar as rotinas financeiras do grupo, incluindo contas a pagar, contas a receber, conciliação financeira, fluxo de caixa e previsibilidade de caixa;</w:t>
+        <w:t xml:space="preserve">Executar as rotinas de contas a pagar, incluindo recebimento, conferência e lançamento de boletos, notas fiscais, guias e faturas, programação dos pagamentos para aprovação da CONTRATANTE e arquivamento dos respectivos comprovantes;</w:t>
       </w:r>
     </w:p>
     <w:p>
@@ -467,7 +467,7 @@
         </w:numPr>
       </w:pPr>
       <w:r>
-        <w:t xml:space="preserve">Elaborar, revisar e acompanhar relatórios financeiros, demonstrativos gerenciais, DRE gerencial, indicadores de desempenho financeiro, análises de resultado e projeções financeiras;</w:t>
+        <w:t xml:space="preserve">Executar as rotinas de contas a receber, incluindo registro dos valores a receber, baixa dos recebimentos, acompanhamento de vencimentos e apoio à cobrança de clientes inadimplentes, conforme orientações da CONTRATANTE;</w:t>
       </w:r>
     </w:p>
     <w:p>
@@ -478,7 +478,7 @@
         </w:numPr>
       </w:pPr>
       <w:r>
-        <w:t xml:space="preserve">Apoiar a definição e o acompanhamento de orçamento, centros de custo, metas financeiras, controle de despesas, margens, custos fixos, custos variáveis e rentabilidade por unidade de negócio;</w:t>
+        <w:t xml:space="preserve">Realizar as conciliações bancárias e de cartões, plataformas de pagamento e recebíveis, identificando e reportando eventuais divergências;</w:t>
       </w:r>
     </w:p>
     <w:p>
@@ -489,7 +489,7 @@
         </w:numPr>
       </w:pPr>
       <w:r>
-        <w:t xml:space="preserve">Acompanhar processos de faturamento, emissão de notas fiscais, recebíveis, inadimplência, cobranças, conferências e controles financeiros necessários à segurança da operação;</w:t>
+        <w:t xml:space="preserve">Manter atualizados o fluxo de caixa realizado e o projetado, alimentando planilhas, sistemas e controles que assegurem a previsibilidade de caixa;</w:t>
       </w:r>
     </w:p>
     <w:p>
@@ -500,7 +500,7 @@
         </w:numPr>
       </w:pPr>
       <w:r>
-        <w:t xml:space="preserve">Realizar interface técnica com contabilidade, fiscal, jurídico, áreas internas, fornecedores, bancos, plataformas financeiras e demais parceiros relacionados à operação financeira;</w:t>
+        <w:t xml:space="preserve">Apoiar o faturamento e a emissão de notas fiscais, bem como controlar as notas fiscais emitidas e recebidas;</w:t>
       </w:r>
     </w:p>
     <w:p>
@@ -511,7 +511,7 @@
         </w:numPr>
       </w:pPr>
       <w:r>
-        <w:t xml:space="preserve">Propor melhorias de processos, fluxos, controles internos, políticas financeiras, rotinas de autorização, governança financeira e padronização documental;</w:t>
+        <w:t xml:space="preserve">Organizar e encaminhar à contabilidade, nos prazos definidos, extratos, notas fiscais, comprovantes e demais documentos necessários ao fechamento mensal;</w:t>
       </w:r>
     </w:p>
     <w:p>
@@ -522,7 +522,7 @@
         </w:numPr>
       </w:pPr>
       <w:r>
-        <w:t xml:space="preserve">Acompanhar indicadores estratégicos e operacionais do setor financeiro, reportando informações, riscos, desvios, inconsistências e oportunidades de melhoria à CONTRATANTE;</w:t>
+        <w:t xml:space="preserve">Organizar, padronizar e manter atualizado o arquivo físico e digital de documentos financeiros e administrativos, incluindo contratos, cadastros de fornecedores e controles de vencimentos;</w:t>
       </w:r>
     </w:p>
     <w:p>
@@ -533,7 +533,7 @@
         </w:numPr>
       </w:pPr>
       <w:r>
-        <w:t xml:space="preserve">Apoiar a organização documental, registro de informações financeiras, criação de dashboards, planilhas, relatórios, sistemas e controles necessários à adequada gestão financeira;</w:t>
+        <w:t xml:space="preserve">Elaborar e manter atualizados os relatórios, planilhas e controles operacionais definidos pela CONTRATANTE, fornecendo à gestão e à diretoria informações confiáveis e tempestivas para a tomada de decisões;</w:t>
       </w:r>
     </w:p>
     <w:p>

</xml_diff>